<commit_message>
docs: publish English learner roadmap
</commit_message>
<xml_diff>
--- a/dist/ML-Roadmap-24-Tuan-AWS-Cloud-Club.docx
+++ b/dist/ML-Roadmap-24-Tuan-AWS-Cloud-Club.docx
@@ -15281,7 +15281,7 @@
           </w:tcPr>
           <w:p>
             <w:r>
-              <w:t>Chạy được nhưng bằng chứng</w:t>
+              <w:t>Chạy được nhưng bằng chứng, kiểm thử hoặc khả năng tái lập còn thiếu.</w:t>
             </w:r>
           </w:p>
         </w:tc>
@@ -15337,7 +15337,7 @@
           </w:tcPr>
           <w:p>
             <w:r>
-              <w:t>Đúng</w:t>
+              <w:t>Đúng, tái lập, có đánh giá và giải thích quyết định.</w:t>
             </w:r>
           </w:p>
         </w:tc>
@@ -15393,7 +15393,7 @@
           </w:tcPr>
           <w:p>
             <w:r>
-              <w:t>Có phân tích lỗi sâu</w:t>
+              <w:t>Có phân tích lỗi sâu, trade-off rõ và một cải tiến có kiểm soát.</w:t>
             </w:r>
           </w:p>
         </w:tc>

</xml_diff>